<commit_message>
added metadata for grader
</commit_message>
<xml_diff>
--- a/wdd330-professional-development.docx
+++ b/wdd330-professional-development.docx
@@ -581,7 +581,23 @@
                 <w:sz w:val="24"/>
                 <w:szCs w:val="24"/>
               </w:rPr>
-              <w:t>You are progressing nicely in this area and meet expectations.</w:t>
+              <w:t xml:space="preserve">You are progressing nicely in this area and </w:t>
+            </w:r>
+            <w:proofErr w:type="gramStart"/>
+            <w:r>
+              <w:rPr>
+                <w:sz w:val="24"/>
+                <w:szCs w:val="24"/>
+              </w:rPr>
+              <w:t>meet</w:t>
+            </w:r>
+            <w:proofErr w:type="gramEnd"/>
+            <w:r>
+              <w:rPr>
+                <w:sz w:val="24"/>
+                <w:szCs w:val="24"/>
+              </w:rPr>
+              <w:t xml:space="preserve"> expectations.</w:t>
             </w:r>
           </w:p>
         </w:tc>
@@ -1097,38 +1113,98 @@
                 <w:sz w:val="18"/>
                 <w:szCs w:val="18"/>
               </w:rPr>
-              <w:t>contribute to our project. My natural instinct in this case would have been to get the problem done on my own, but instead, I worked together with my teammate to get him started and then I followed up with him afterward to make sure he was able to get his task done.</w:t>
-            </w:r>
-          </w:p>
-          <w:p>
-            <w:pPr>
-              <w:pStyle w:val="NoSpacing"/>
+              <w:t xml:space="preserve">contribute to our project. My </w:t>
+            </w:r>
+            <w:proofErr w:type="gramStart"/>
+            <w:r>
               <w:rPr>
                 <w:i/>
                 <w:iCs/>
                 <w:sz w:val="18"/>
                 <w:szCs w:val="18"/>
               </w:rPr>
-            </w:pPr>
-          </w:p>
-          <w:p>
-            <w:pPr>
-              <w:pStyle w:val="NoSpacing"/>
+              <w:t>natural instinct</w:t>
+            </w:r>
+            <w:proofErr w:type="gramEnd"/>
+            <w:r>
               <w:rPr>
                 <w:i/>
                 <w:iCs/>
                 <w:sz w:val="18"/>
                 <w:szCs w:val="18"/>
               </w:rPr>
-            </w:pPr>
-            <w:r>
+              <w:t xml:space="preserve"> in this case would have been to get the problem done on my own, but instead, I worked together with my teammate to get him started and then I followed up with him afterward to make sure he was able to get his task done.</w:t>
+            </w:r>
+          </w:p>
+          <w:p>
+            <w:pPr>
+              <w:pStyle w:val="NoSpacing"/>
               <w:rPr>
                 <w:i/>
                 <w:iCs/>
                 <w:sz w:val="18"/>
                 <w:szCs w:val="18"/>
               </w:rPr>
-              <w:t>This definitely took more of my time, but I was really glad to see his spirits lifted as he made progress.</w:t>
+            </w:pPr>
+          </w:p>
+          <w:p>
+            <w:pPr>
+              <w:pStyle w:val="NoSpacing"/>
+              <w:rPr>
+                <w:i/>
+                <w:iCs/>
+                <w:sz w:val="18"/>
+                <w:szCs w:val="18"/>
+              </w:rPr>
+            </w:pPr>
+            <w:r>
+              <w:rPr>
+                <w:i/>
+                <w:iCs/>
+                <w:sz w:val="18"/>
+                <w:szCs w:val="18"/>
+              </w:rPr>
+              <w:t xml:space="preserve">This </w:t>
+            </w:r>
+            <w:proofErr w:type="gramStart"/>
+            <w:r>
+              <w:rPr>
+                <w:i/>
+                <w:iCs/>
+                <w:sz w:val="18"/>
+                <w:szCs w:val="18"/>
+              </w:rPr>
+              <w:t>definitely took</w:t>
+            </w:r>
+            <w:proofErr w:type="gramEnd"/>
+            <w:r>
+              <w:rPr>
+                <w:i/>
+                <w:iCs/>
+                <w:sz w:val="18"/>
+                <w:szCs w:val="18"/>
+              </w:rPr>
+              <w:t xml:space="preserve"> more of my time, but I was </w:t>
+            </w:r>
+            <w:proofErr w:type="gramStart"/>
+            <w:r>
+              <w:rPr>
+                <w:i/>
+                <w:iCs/>
+                <w:sz w:val="18"/>
+                <w:szCs w:val="18"/>
+              </w:rPr>
+              <w:t>really glad</w:t>
+            </w:r>
+            <w:proofErr w:type="gramEnd"/>
+            <w:r>
+              <w:rPr>
+                <w:i/>
+                <w:iCs/>
+                <w:sz w:val="18"/>
+                <w:szCs w:val="18"/>
+              </w:rPr>
+              <w:t xml:space="preserve"> to see his spirits lifted as he made progress.</w:t>
             </w:r>
           </w:p>
         </w:tc>
@@ -1292,10 +1368,10 @@
         <w:tblLook w:val="04A0" w:firstRow="1" w:lastRow="0" w:firstColumn="1" w:lastColumn="0" w:noHBand="0" w:noVBand="1"/>
       </w:tblPr>
       <w:tblGrid>
-        <w:gridCol w:w="2855"/>
+        <w:gridCol w:w="2852"/>
         <w:gridCol w:w="855"/>
-        <w:gridCol w:w="995"/>
-        <w:gridCol w:w="5105"/>
+        <w:gridCol w:w="994"/>
+        <w:gridCol w:w="5109"/>
       </w:tblGrid>
       <w:tr>
         <w:trPr>
@@ -1509,6 +1585,9 @@
               <w:pStyle w:val="NoSpacing"/>
               <w:jc w:val="center"/>
             </w:pPr>
+            <w:r>
+              <w:t>3</w:t>
+            </w:r>
           </w:p>
         </w:tc>
         <w:tc>
@@ -1519,6 +1598,9 @@
             <w:pPr>
               <w:pStyle w:val="NoSpacing"/>
             </w:pPr>
+            <w:r>
+              <w:t>3</w:t>
+            </w:r>
           </w:p>
         </w:tc>
         <w:tc>
@@ -1529,6 +1611,43 @@
             <w:pPr>
               <w:pStyle w:val="NoSpacing"/>
             </w:pPr>
+            <w:r>
+              <w:t>I created a dynamic header and footer</w:t>
+            </w:r>
+            <w:r>
+              <w:t>.</w:t>
+            </w:r>
+            <w:r>
+              <w:t xml:space="preserve"> This </w:t>
+            </w:r>
+            <w:proofErr w:type="gramStart"/>
+            <w:r>
+              <w:t>way it</w:t>
+            </w:r>
+            <w:proofErr w:type="gramEnd"/>
+            <w:r>
+              <w:t xml:space="preserve"> ensures that the header and footer </w:t>
+            </w:r>
+            <w:proofErr w:type="gramStart"/>
+            <w:r>
+              <w:t>remains</w:t>
+            </w:r>
+            <w:proofErr w:type="gramEnd"/>
+            <w:r>
+              <w:t xml:space="preserve"> consistent throughout the site</w:t>
+            </w:r>
+            <w:r>
+              <w:t>.</w:t>
+            </w:r>
+            <w:r>
+              <w:t xml:space="preserve"> I also created a template</w:t>
+            </w:r>
+            <w:r>
+              <w:t xml:space="preserve"> </w:t>
+            </w:r>
+            <w:r>
+              <w:t>for the items that show up in the shopping cart.</w:t>
+            </w:r>
           </w:p>
         </w:tc>
       </w:tr>
@@ -1567,6 +1686,9 @@
             <w:pPr>
               <w:pStyle w:val="NoSpacing"/>
             </w:pPr>
+            <w:r>
+              <w:t>5</w:t>
+            </w:r>
           </w:p>
         </w:tc>
         <w:tc>
@@ -1577,6 +1699,59 @@
             <w:pPr>
               <w:pStyle w:val="NoSpacing"/>
             </w:pPr>
+            <w:r>
+              <w:t xml:space="preserve">I couldn’t reach the </w:t>
+            </w:r>
+            <w:proofErr w:type="spellStart"/>
+            <w:r>
+              <w:t>ZenQuotes</w:t>
+            </w:r>
+            <w:proofErr w:type="spellEnd"/>
+            <w:r>
+              <w:t xml:space="preserve"> </w:t>
+            </w:r>
+            <w:proofErr w:type="gramStart"/>
+            <w:r>
+              <w:t>API</w:t>
+            </w:r>
+            <w:proofErr w:type="gramEnd"/>
+            <w:r>
+              <w:t xml:space="preserve"> so I had to create a JSON file</w:t>
+            </w:r>
+            <w:r>
+              <w:t>.</w:t>
+            </w:r>
+            <w:r>
+              <w:t xml:space="preserve"> I decided to try accessing a GitHub file</w:t>
+            </w:r>
+            <w:r>
+              <w:t>.</w:t>
+            </w:r>
+            <w:r>
+              <w:t xml:space="preserve"> I had to convert my </w:t>
+            </w:r>
+            <w:proofErr w:type="spellStart"/>
+            <w:r>
+              <w:t>quotes.mjs</w:t>
+            </w:r>
+            <w:proofErr w:type="spellEnd"/>
+            <w:r>
+              <w:t xml:space="preserve"> to not use a fetch</w:t>
+            </w:r>
+            <w:r>
+              <w:t>.</w:t>
+            </w:r>
+            <w:r>
+              <w:t xml:space="preserve"> Instead, I created a </w:t>
+            </w:r>
+            <w:proofErr w:type="spellStart"/>
+            <w:r>
+              <w:t>json</w:t>
+            </w:r>
+            <w:proofErr w:type="spellEnd"/>
+            <w:r>
+              <w:t xml:space="preserve"> with only 300 quotes…</w:t>
+            </w:r>
           </w:p>
         </w:tc>
       </w:tr>
@@ -1615,6 +1790,9 @@
             <w:pPr>
               <w:pStyle w:val="NoSpacing"/>
             </w:pPr>
+            <w:r>
+              <w:t>6</w:t>
+            </w:r>
           </w:p>
         </w:tc>
         <w:tc>
@@ -1625,6 +1803,21 @@
             <w:pPr>
               <w:pStyle w:val="NoSpacing"/>
             </w:pPr>
+            <w:r>
+              <w:t>I changed the background image to save a cached image</w:t>
+            </w:r>
+            <w:r>
+              <w:t>.</w:t>
+            </w:r>
+            <w:r>
+              <w:t xml:space="preserve"> I added a background overlay that adjusts with the dark/light mode</w:t>
+            </w:r>
+            <w:r>
+              <w:t>.</w:t>
+            </w:r>
+            <w:r>
+              <w:t xml:space="preserve"> I added the option to match the light/dark theme to the user's system.</w:t>
+            </w:r>
           </w:p>
         </w:tc>
       </w:tr>
@@ -1656,6 +1849,9 @@
               <w:pStyle w:val="NoSpacing"/>
               <w:jc w:val="center"/>
             </w:pPr>
+            <w:r>
+              <w:t>3</w:t>
+            </w:r>
           </w:p>
         </w:tc>
         <w:tc>
@@ -1666,6 +1862,9 @@
             <w:pPr>
               <w:pStyle w:val="NoSpacing"/>
             </w:pPr>
+            <w:r>
+              <w:t>1</w:t>
+            </w:r>
           </w:p>
         </w:tc>
         <w:tc>
@@ -1676,6 +1875,32 @@
             <w:pPr>
               <w:pStyle w:val="NoSpacing"/>
             </w:pPr>
+            <w:r>
+              <w:t>I learned how to use Trello, created a board</w:t>
+            </w:r>
+            <w:r>
+              <w:t>,</w:t>
+            </w:r>
+            <w:r>
+              <w:t xml:space="preserve"> cloned the given repository</w:t>
+            </w:r>
+            <w:r>
+              <w:t>,</w:t>
+            </w:r>
+            <w:r>
+              <w:t xml:space="preserve"> completed the </w:t>
+            </w:r>
+            <w:proofErr w:type="spellStart"/>
+            <w:r>
+              <w:t>npm</w:t>
+            </w:r>
+            <w:proofErr w:type="spellEnd"/>
+            <w:r>
+              <w:t xml:space="preserve"> install, lint, format, run, and build commands. I also signed up for a free Render account</w:t>
+            </w:r>
+            <w:r>
+              <w:t>.</w:t>
+            </w:r>
           </w:p>
         </w:tc>
       </w:tr>
@@ -1714,6 +1939,9 @@
             <w:pPr>
               <w:pStyle w:val="NoSpacing"/>
             </w:pPr>
+            <w:r>
+              <w:t>3</w:t>
+            </w:r>
           </w:p>
         </w:tc>
         <w:tc>
@@ -1724,6 +1952,26 @@
             <w:pPr>
               <w:pStyle w:val="NoSpacing"/>
             </w:pPr>
+            <w:r>
+              <w:t xml:space="preserve">I explored how to pull data from a live external site instead of a local JSON. </w:t>
+            </w:r>
+            <w:r>
+              <w:t>It took a lot of work to make the website show the images and items from the live website</w:t>
+            </w:r>
+            <w:r>
+              <w:t>.</w:t>
+            </w:r>
+            <w:r>
+              <w:t xml:space="preserve"> I </w:t>
+            </w:r>
+            <w:proofErr w:type="gramStart"/>
+            <w:r>
+              <w:t>have to</w:t>
+            </w:r>
+            <w:proofErr w:type="gramEnd"/>
+            <w:r>
+              <w:t xml:space="preserve"> trust that what the website renders is all the intended data.</w:t>
+            </w:r>
           </w:p>
         </w:tc>
       </w:tr>
@@ -1762,6 +2010,9 @@
             <w:pPr>
               <w:pStyle w:val="NoSpacing"/>
             </w:pPr>
+            <w:r>
+              <w:t>6</w:t>
+            </w:r>
           </w:p>
         </w:tc>
         <w:tc>
@@ -1772,6 +2023,30 @@
             <w:pPr>
               <w:pStyle w:val="NoSpacing"/>
             </w:pPr>
+            <w:r>
+              <w:t xml:space="preserve">I finished completing API Integration: </w:t>
+            </w:r>
+            <w:proofErr w:type="spellStart"/>
+            <w:r>
+              <w:t>WorldTimeAPI</w:t>
+            </w:r>
+            <w:proofErr w:type="spellEnd"/>
+            <w:r>
+              <w:t>.</w:t>
+            </w:r>
+            <w:r>
+              <w:t xml:space="preserve"> I changed the background image to save a cached </w:t>
+            </w:r>
+            <w:r>
+              <w:lastRenderedPageBreak/>
+              <w:t>image</w:t>
+            </w:r>
+            <w:r>
+              <w:t>.</w:t>
+            </w:r>
+            <w:r>
+              <w:t xml:space="preserve"> I added the option to match the light/dark theme to the user's system.</w:t>
+            </w:r>
           </w:p>
         </w:tc>
       </w:tr>
@@ -1789,6 +2064,7 @@
               <w:pStyle w:val="NoSpacing"/>
             </w:pPr>
             <w:r>
+              <w:lastRenderedPageBreak/>
               <w:t>Become a person who enjoys helping and learning from others.</w:t>
             </w:r>
           </w:p>
@@ -1803,6 +2079,9 @@
               <w:pStyle w:val="NoSpacing"/>
               <w:jc w:val="center"/>
             </w:pPr>
+            <w:r>
+              <w:t>3</w:t>
+            </w:r>
           </w:p>
         </w:tc>
         <w:tc>
@@ -1813,6 +2092,9 @@
             <w:pPr>
               <w:pStyle w:val="NoSpacing"/>
             </w:pPr>
+            <w:r>
+              <w:t>1</w:t>
+            </w:r>
           </w:p>
         </w:tc>
         <w:tc>
@@ -1823,6 +2105,26 @@
             <w:pPr>
               <w:pStyle w:val="NoSpacing"/>
             </w:pPr>
+            <w:r>
+              <w:t xml:space="preserve">Even though our team meeting didn’t happen, I still took responsibility for helping my team members succeed. </w:t>
+            </w:r>
+            <w:r>
+              <w:t xml:space="preserve">I still made the effort to complete our Team Activity and reach out to each member of my group to ensure they </w:t>
+            </w:r>
+            <w:proofErr w:type="gramStart"/>
+            <w:r>
+              <w:t>completed</w:t>
+            </w:r>
+            <w:proofErr w:type="gramEnd"/>
+            <w:r>
+              <w:t xml:space="preserve"> it</w:t>
+            </w:r>
+            <w:r>
+              <w:t xml:space="preserve">. </w:t>
+            </w:r>
+            <w:r>
+              <w:t>I was able to send them all the information we needed to complete the assignment in time.</w:t>
+            </w:r>
           </w:p>
         </w:tc>
       </w:tr>
@@ -1861,6 +2163,9 @@
             <w:pPr>
               <w:pStyle w:val="NoSpacing"/>
             </w:pPr>
+            <w:r>
+              <w:t>2</w:t>
+            </w:r>
           </w:p>
         </w:tc>
         <w:tc>
@@ -1871,6 +2176,30 @@
             <w:pPr>
               <w:pStyle w:val="NoSpacing"/>
             </w:pPr>
+            <w:r>
+              <w:t xml:space="preserve">I prepared ahead of time, studied the material, and guided my team through the activity step by step. </w:t>
+            </w:r>
+            <w:r>
+              <w:t>I was able to confidently and clearly explain all that the Team Activity required</w:t>
+            </w:r>
+            <w:r>
+              <w:t>.</w:t>
+            </w:r>
+            <w:r>
+              <w:t xml:space="preserve"> I checked in with each team member to make sure they were understanding</w:t>
+            </w:r>
+            <w:r>
+              <w:t>.</w:t>
+            </w:r>
+            <w:r>
+              <w:t xml:space="preserve"> They asked questions</w:t>
+            </w:r>
+            <w:r>
+              <w:t>,</w:t>
+            </w:r>
+            <w:r>
+              <w:t xml:space="preserve"> and I was able to answer because I had researched those concepts beforehand.</w:t>
+            </w:r>
           </w:p>
         </w:tc>
       </w:tr>
@@ -1909,6 +2238,9 @@
             <w:pPr>
               <w:pStyle w:val="NoSpacing"/>
             </w:pPr>
+            <w:r>
+              <w:t>4</w:t>
+            </w:r>
           </w:p>
         </w:tc>
         <w:tc>
@@ -1919,6 +2251,26 @@
             <w:pPr>
               <w:pStyle w:val="NoSpacing"/>
             </w:pPr>
+            <w:r>
+              <w:t xml:space="preserve">I completed the required individual task early so my team could move forward with the team activity. I chose </w:t>
+            </w:r>
+            <w:r>
+              <w:t xml:space="preserve">to work on Total$ in Cart because it’s required to be </w:t>
+            </w:r>
+            <w:proofErr w:type="gramStart"/>
+            <w:r>
+              <w:t>complete</w:t>
+            </w:r>
+            <w:proofErr w:type="gramEnd"/>
+            <w:r>
+              <w:t xml:space="preserve"> before I can begin working on the W04 Team Activity</w:t>
+            </w:r>
+            <w:r>
+              <w:t>.</w:t>
+            </w:r>
+            <w:r>
+              <w:t xml:space="preserve"> I was able to complete it.</w:t>
+            </w:r>
           </w:p>
         </w:tc>
       </w:tr>
@@ -1950,6 +2302,9 @@
               <w:pStyle w:val="NoSpacing"/>
               <w:jc w:val="center"/>
             </w:pPr>
+            <w:r>
+              <w:t>3</w:t>
+            </w:r>
           </w:p>
         </w:tc>
         <w:tc>
@@ -1960,6 +2315,9 @@
             <w:pPr>
               <w:pStyle w:val="NoSpacing"/>
             </w:pPr>
+            <w:r>
+              <w:t>2</w:t>
+            </w:r>
           </w:p>
         </w:tc>
         <w:tc>
@@ -1970,6 +2328,42 @@
             <w:pPr>
               <w:pStyle w:val="NoSpacing"/>
             </w:pPr>
+            <w:r>
+              <w:t xml:space="preserve">I had a crashing page, isolated the </w:t>
+            </w:r>
+            <w:proofErr w:type="gramStart"/>
+            <w:r>
+              <w:t>cause ,</w:t>
+            </w:r>
+            <w:proofErr w:type="gramEnd"/>
+            <w:r>
+              <w:t xml:space="preserve"> and solved it by breaking the logic into smaller steps. </w:t>
+            </w:r>
+            <w:r>
+              <w:t>I fixed the error by handling the case where the cart is empty</w:t>
+            </w:r>
+            <w:r>
+              <w:t>.</w:t>
+            </w:r>
+            <w:r>
+              <w:t xml:space="preserve"> I updated cart.js so that if the cart is empty, </w:t>
+            </w:r>
+            <w:proofErr w:type="spellStart"/>
+            <w:r>
+              <w:t>cartItems</w:t>
+            </w:r>
+            <w:proofErr w:type="spellEnd"/>
+            <w:r>
+              <w:t xml:space="preserve"> </w:t>
+            </w:r>
+            <w:proofErr w:type="gramStart"/>
+            <w:r>
+              <w:t>becomes</w:t>
+            </w:r>
+            <w:proofErr w:type="gramEnd"/>
+            <w:r>
+              <w:t xml:space="preserve"> an empty array instead of null.</w:t>
+            </w:r>
           </w:p>
         </w:tc>
       </w:tr>
@@ -2008,6 +2402,9 @@
             <w:pPr>
               <w:pStyle w:val="NoSpacing"/>
             </w:pPr>
+            <w:r>
+              <w:t>4</w:t>
+            </w:r>
           </w:p>
         </w:tc>
         <w:tc>
@@ -2018,6 +2415,20 @@
             <w:pPr>
               <w:pStyle w:val="NoSpacing"/>
             </w:pPr>
+            <w:r>
+              <w:t xml:space="preserve">I completed the smaller task first instead of letting our team get overwhelmed. I chose </w:t>
+            </w:r>
+            <w:r>
+              <w:t xml:space="preserve">to work on Total$ in Cart because it’s required to be complete before </w:t>
+            </w:r>
+            <w:proofErr w:type="gramStart"/>
+            <w:r>
+              <w:t>I can</w:t>
+            </w:r>
+            <w:proofErr w:type="gramEnd"/>
+            <w:r>
+              <w:t xml:space="preserve"> begin working on the W04 Team Activity.</w:t>
+            </w:r>
           </w:p>
         </w:tc>
       </w:tr>
@@ -2056,6 +2467,9 @@
             <w:pPr>
               <w:pStyle w:val="NoSpacing"/>
             </w:pPr>
+            <w:r>
+              <w:t>6</w:t>
+            </w:r>
           </w:p>
         </w:tc>
         <w:tc>
@@ -2066,6 +2480,35 @@
             <w:pPr>
               <w:pStyle w:val="NoSpacing"/>
             </w:pPr>
+            <w:r>
+              <w:t xml:space="preserve">I completed each feature of my Final Activity separately. </w:t>
+            </w:r>
+            <w:r>
+              <w:t xml:space="preserve">I finished completing API Integration: </w:t>
+            </w:r>
+            <w:proofErr w:type="spellStart"/>
+            <w:r>
+              <w:t>WorldTimeAPI</w:t>
+            </w:r>
+            <w:proofErr w:type="spellEnd"/>
+            <w:r>
+              <w:t xml:space="preserve">. </w:t>
+            </w:r>
+            <w:r>
+              <w:t>I finished doing the habit tracker</w:t>
+            </w:r>
+            <w:r>
+              <w:t>.</w:t>
+            </w:r>
+            <w:r>
+              <w:t xml:space="preserve"> I finished doing the checklist</w:t>
+            </w:r>
+            <w:r>
+              <w:t>.</w:t>
+            </w:r>
+            <w:r>
+              <w:t xml:space="preserve"> I finished doing the customization and settings.</w:t>
+            </w:r>
           </w:p>
         </w:tc>
       </w:tr>
@@ -2097,6 +2540,9 @@
               <w:pStyle w:val="NoSpacing"/>
               <w:jc w:val="center"/>
             </w:pPr>
+            <w:r>
+              <w:t>3</w:t>
+            </w:r>
           </w:p>
         </w:tc>
         <w:tc>
@@ -2107,6 +2553,9 @@
             <w:pPr>
               <w:pStyle w:val="NoSpacing"/>
             </w:pPr>
+            <w:r>
+              <w:t>2</w:t>
+            </w:r>
           </w:p>
         </w:tc>
         <w:tc>
@@ -2117,6 +2566,48 @@
             <w:pPr>
               <w:pStyle w:val="NoSpacing"/>
             </w:pPr>
+            <w:r>
+              <w:t xml:space="preserve">I found a runtime error, traced it to a null value, and created a defensive fix that prevents further crashes. </w:t>
+            </w:r>
+            <w:r>
+              <w:t>I fixed the error by handling the case where the cart is empty</w:t>
+            </w:r>
+            <w:r>
+              <w:t>.</w:t>
+            </w:r>
+            <w:r>
+              <w:t xml:space="preserve"> </w:t>
+            </w:r>
+            <w:proofErr w:type="spellStart"/>
+            <w:r>
+              <w:t>getLocalStorage</w:t>
+            </w:r>
+            <w:proofErr w:type="spellEnd"/>
+            <w:r>
+              <w:t>('so-cart') returned null</w:t>
+            </w:r>
+            <w:r>
+              <w:t>.</w:t>
+            </w:r>
+            <w:r>
+              <w:t xml:space="preserve"> I updated cart.js so that if the cart is empty, </w:t>
+            </w:r>
+            <w:proofErr w:type="spellStart"/>
+            <w:r>
+              <w:t>cartItems</w:t>
+            </w:r>
+            <w:proofErr w:type="spellEnd"/>
+            <w:r>
+              <w:t xml:space="preserve"> </w:t>
+            </w:r>
+            <w:proofErr w:type="gramStart"/>
+            <w:r>
+              <w:t>becomes</w:t>
+            </w:r>
+            <w:proofErr w:type="gramEnd"/>
+            <w:r>
+              <w:t xml:space="preserve"> an empty array instead of null.</w:t>
+            </w:r>
           </w:p>
         </w:tc>
       </w:tr>
@@ -2154,6 +2645,9 @@
             <w:pPr>
               <w:pStyle w:val="NoSpacing"/>
             </w:pPr>
+            <w:r>
+              <w:t>3</w:t>
+            </w:r>
           </w:p>
         </w:tc>
         <w:tc>
@@ -2164,6 +2658,32 @@
             <w:pPr>
               <w:pStyle w:val="NoSpacing"/>
             </w:pPr>
+            <w:r>
+              <w:t xml:space="preserve">I noticed missing images and investigated the cause. </w:t>
+            </w:r>
+            <w:r>
+              <w:t xml:space="preserve">I noticed that the images of the items in the cart </w:t>
+            </w:r>
+            <w:r>
+              <w:t>were</w:t>
+            </w:r>
+            <w:r>
+              <w:t xml:space="preserve"> not </w:t>
+            </w:r>
+            <w:proofErr w:type="gramStart"/>
+            <w:r>
+              <w:t>rendering</w:t>
+            </w:r>
+            <w:proofErr w:type="gramEnd"/>
+            <w:r>
+              <w:t>. I wonder</w:t>
+            </w:r>
+            <w:r>
+              <w:t>ed</w:t>
+            </w:r>
+            <w:r>
+              <w:t xml:space="preserve"> if I missed something in this activity, or if this is a task to work on in a later assignment.</w:t>
+            </w:r>
           </w:p>
         </w:tc>
       </w:tr>
@@ -2201,6 +2721,9 @@
             <w:pPr>
               <w:pStyle w:val="NoSpacing"/>
             </w:pPr>
+            <w:r>
+              <w:t>6</w:t>
+            </w:r>
           </w:p>
         </w:tc>
         <w:tc>
@@ -2211,6 +2734,20 @@
             <w:pPr>
               <w:pStyle w:val="NoSpacing"/>
             </w:pPr>
+            <w:r>
+              <w:t xml:space="preserve">I encountered a UI bug in the habit tracker. I investigated until I understood the behavior and </w:t>
+            </w:r>
+            <w:proofErr w:type="gramStart"/>
+            <w:r>
+              <w:t>made adjustments</w:t>
+            </w:r>
+            <w:proofErr w:type="gramEnd"/>
+            <w:r>
+              <w:t xml:space="preserve">. </w:t>
+            </w:r>
+            <w:r>
+              <w:t>It took a while because I thought it wasn’t unchecking the checkmark.</w:t>
+            </w:r>
           </w:p>
         </w:tc>
       </w:tr>
@@ -3477,7 +4014,6 @@
   <w:style w:type="character" w:default="1" w:styleId="DefaultParagraphFont">
     <w:name w:val="Default Paragraph Font"/>
     <w:uiPriority w:val="1"/>
-    <w:semiHidden/>
     <w:unhideWhenUsed/>
   </w:style>
   <w:style w:type="table" w:default="1" w:styleId="TableNormal">
@@ -3671,6 +4207,19 @@
     <w:rPr>
       <w:color w:val="605E5C"/>
       <w:shd w:val="clear" w:color="auto" w:fill="E1DFDD"/>
+    </w:rPr>
+  </w:style>
+  <w:style w:type="paragraph" w:styleId="NormalWeb">
+    <w:name w:val="Normal (Web)"/>
+    <w:basedOn w:val="Normal"/>
+    <w:uiPriority w:val="99"/>
+    <w:semiHidden/>
+    <w:unhideWhenUsed/>
+    <w:rsid w:val="001E56B9"/>
+    <w:rPr>
+      <w:rFonts w:ascii="Times New Roman" w:hAnsi="Times New Roman" w:cs="Times New Roman"/>
+      <w:sz w:val="24"/>
+      <w:szCs w:val="24"/>
     </w:rPr>
   </w:style>
 </w:styles>
@@ -3938,6 +4487,21 @@
 </file>
 
 <file path=customXml/item1.xml><?xml version="1.0" encoding="utf-8"?>
+<?mso-contentType ?>
+<FormTemplates xmlns="http://schemas.microsoft.com/sharepoint/v3/contenttype/forms">
+  <Display>DocumentLibraryForm</Display>
+  <Edit>DocumentLibraryForm</Edit>
+  <New>DocumentLibraryForm</New>
+</FormTemplates>
+</file>
+
+<file path=customXml/item2.xml><?xml version="1.0" encoding="utf-8"?>
+<p:properties xmlns:p="http://schemas.microsoft.com/office/2006/metadata/properties" xmlns:xsi="http://www.w3.org/2001/XMLSchema-instance" xmlns:pc="http://schemas.microsoft.com/office/infopath/2007/PartnerControls">
+  <documentManagement/>
+</p:properties>
+</file>
+
+<file path=customXml/item3.xml><?xml version="1.0" encoding="utf-8"?>
 <ct:contentTypeSchema xmlns:ct="http://schemas.microsoft.com/office/2006/metadata/contentType" xmlns:ma="http://schemas.microsoft.com/office/2006/metadata/properties/metaAttributes" ct:_="" ma:_="" ma:contentTypeName="Document" ma:contentTypeID="0x0101003C76346AFD0E164A896179F8A3CF5BCA" ma:contentTypeVersion="2" ma:contentTypeDescription="Create a new document." ma:contentTypeScope="" ma:versionID="141df0e014df6f30cf97f9d327d4cb77">
   <xsd:schema xmlns:xsd="http://www.w3.org/2001/XMLSchema" xmlns:xs="http://www.w3.org/2001/XMLSchema" xmlns:p="http://schemas.microsoft.com/office/2006/metadata/properties" xmlns:ns2="a858a2f8-06bb-467c-9041-0de76784e431" targetNamespace="http://schemas.microsoft.com/office/2006/metadata/properties" ma:root="true" ma:fieldsID="ae29bf6651c6200169aa9f8965b8a32a" ns2:_="">
     <xsd:import namespace="a858a2f8-06bb-467c-9041-0de76784e431"/>
@@ -4069,22 +4633,24 @@
 </ct:contentTypeSchema>
 </file>
 
-<file path=customXml/item2.xml><?xml version="1.0" encoding="utf-8"?>
-<p:properties xmlns:p="http://schemas.microsoft.com/office/2006/metadata/properties" xmlns:xsi="http://www.w3.org/2001/XMLSchema-instance" xmlns:pc="http://schemas.microsoft.com/office/infopath/2007/PartnerControls">
-  <documentManagement/>
-</p:properties>
+<file path=customXml/itemProps1.xml><?xml version="1.0" encoding="utf-8"?>
+<ds:datastoreItem xmlns:ds="http://schemas.openxmlformats.org/officeDocument/2006/customXml" ds:itemID="{D02D787C-96F3-476C-AC00-5E042564F4E3}">
+  <ds:schemaRefs>
+    <ds:schemaRef ds:uri="http://schemas.microsoft.com/sharepoint/v3/contenttype/forms"/>
+  </ds:schemaRefs>
+</ds:datastoreItem>
 </file>
 
-<file path=customXml/item3.xml><?xml version="1.0" encoding="utf-8"?>
-<?mso-contentType ?>
-<FormTemplates xmlns="http://schemas.microsoft.com/sharepoint/v3/contenttype/forms">
-  <Display>DocumentLibraryForm</Display>
-  <Edit>DocumentLibraryForm</Edit>
-  <New>DocumentLibraryForm</New>
-</FormTemplates>
+<file path=customXml/itemProps2.xml><?xml version="1.0" encoding="utf-8"?>
+<ds:datastoreItem xmlns:ds="http://schemas.openxmlformats.org/officeDocument/2006/customXml" ds:itemID="{B9AEEB80-803A-4749-92D8-ADC156A01D53}">
+  <ds:schemaRefs>
+    <ds:schemaRef ds:uri="http://schemas.microsoft.com/office/2006/metadata/properties"/>
+    <ds:schemaRef ds:uri="http://schemas.microsoft.com/office/infopath/2007/PartnerControls"/>
+  </ds:schemaRefs>
+</ds:datastoreItem>
 </file>
 
-<file path=customXml/itemProps1.xml><?xml version="1.0" encoding="utf-8"?>
+<file path=customXml/itemProps3.xml><?xml version="1.0" encoding="utf-8"?>
 <ds:datastoreItem xmlns:ds="http://schemas.openxmlformats.org/officeDocument/2006/customXml" ds:itemID="{8BAA337E-7A54-4158-9D91-D28F83B48D18}">
   <ds:schemaRefs>
     <ds:schemaRef ds:uri="http://schemas.microsoft.com/office/2006/metadata/contentType"/>
@@ -4100,21 +4666,4 @@
     <ds:schemaRef ds:uri="http://schemas.microsoft.com/internal/obd"/>
   </ds:schemaRefs>
 </ds:datastoreItem>
-</file>
-
-<file path=customXml/itemProps2.xml><?xml version="1.0" encoding="utf-8"?>
-<ds:datastoreItem xmlns:ds="http://schemas.openxmlformats.org/officeDocument/2006/customXml" ds:itemID="{B9AEEB80-803A-4749-92D8-ADC156A01D53}">
-  <ds:schemaRefs>
-    <ds:schemaRef ds:uri="http://schemas.microsoft.com/office/2006/metadata/properties"/>
-    <ds:schemaRef ds:uri="http://schemas.microsoft.com/office/infopath/2007/PartnerControls"/>
-  </ds:schemaRefs>
-</ds:datastoreItem>
-</file>
-
-<file path=customXml/itemProps3.xml><?xml version="1.0" encoding="utf-8"?>
-<ds:datastoreItem xmlns:ds="http://schemas.openxmlformats.org/officeDocument/2006/customXml" ds:itemID="{D02D787C-96F3-476C-AC00-5E042564F4E3}">
-  <ds:schemaRefs>
-    <ds:schemaRef ds:uri="http://schemas.microsoft.com/sharepoint/v3/contenttype/forms"/>
-  </ds:schemaRefs>
-</ds:datastoreItem>
 </file>
</xml_diff>